<commit_message>
edited Binu.R in duplicate
</commit_message>
<xml_diff>
--- a/Binsha/Binu.R.docx
+++ b/Binsha/Binu.R.docx
@@ -15,6 +15,7 @@
           <w:lang w:eastAsia="hr-HR"/>
         </w:rPr>
       </w:pPr>
+      <w:proofErr w:type="spellStart"/>
       <w:r>
         <w:rPr>
           <w:rFonts w:ascii="Palatino Linotype" w:hAnsi="Palatino Linotype" w:cstheme="minorHAnsi"/>
@@ -24,8 +25,9 @@
           <w:szCs w:val="56"/>
           <w:lang w:eastAsia="hr-HR"/>
         </w:rPr>
-        <w:t>-</w:t>
-      </w:r>
+        <w:t>Binsha</w:t>
+      </w:r>
+      <w:proofErr w:type="spellEnd"/>
       <w:r>
         <w:rPr>
           <w:rFonts w:ascii="Palatino Linotype" w:hAnsi="Palatino Linotype" w:cstheme="minorHAnsi"/>
@@ -35,54 +37,21 @@
           <w:szCs w:val="56"/>
           <w:lang w:eastAsia="hr-HR"/>
         </w:rPr>
-        <w:t xml:space="preserve"> </w:t>
-      </w:r>
-      <w:proofErr w:type="spellStart"/>
+        <w:t xml:space="preserve"> P.P</w:t>
+      </w:r>
       <w:r>
         <w:rPr>
           <w:rFonts w:ascii="Palatino Linotype" w:hAnsi="Palatino Linotype" w:cstheme="minorHAnsi"/>
-          <w:b/>
+          <w:bCs/>
           <w:color w:val="262626" w:themeColor="text1" w:themeTint="D9"/>
           <w:sz w:val="40"/>
           <w:szCs w:val="56"/>
           <w:lang w:eastAsia="hr-HR"/>
         </w:rPr>
-        <w:t>Binsha</w:t>
-      </w:r>
-      <w:proofErr w:type="spellEnd"/>
-      <w:r>
-        <w:rPr>
-          <w:rFonts w:ascii="Palatino Linotype" w:hAnsi="Palatino Linotype" w:cstheme="minorHAnsi"/>
-          <w:b/>
-          <w:color w:val="262626" w:themeColor="text1" w:themeTint="D9"/>
-          <w:sz w:val="40"/>
-          <w:szCs w:val="56"/>
-          <w:lang w:eastAsia="hr-HR"/>
-        </w:rPr>
-        <w:t xml:space="preserve"> P.P</w:t>
-      </w:r>
-      <w:r>
-        <w:rPr>
-          <w:rFonts w:ascii="Palatino Linotype" w:hAnsi="Palatino Linotype" w:cstheme="minorHAnsi"/>
-          <w:bCs/>
-          <w:color w:val="262626" w:themeColor="text1" w:themeTint="D9"/>
-          <w:sz w:val="40"/>
-          <w:szCs w:val="56"/>
-          <w:lang w:eastAsia="hr-HR"/>
-        </w:rPr>
         <w:t xml:space="preserve"> </w:t>
       </w:r>
-      <w:r>
-        <w:rPr>
-          <w:rFonts w:ascii="Palatino Linotype" w:hAnsi="Palatino Linotype" w:cstheme="minorHAnsi"/>
-          <w:b/>
-          <w:color w:val="262626" w:themeColor="text1" w:themeTint="D9"/>
-          <w:sz w:val="40"/>
-          <w:szCs w:val="56"/>
-          <w:lang w:eastAsia="hr-HR"/>
-        </w:rPr>
-        <w:t>-</w:t>
-      </w:r>
+      <w:bookmarkStart w:id="0" w:name="_GoBack"/>
+      <w:bookmarkEnd w:id="0"/>
     </w:p>
     <w:p>
       <w:pPr>
@@ -722,7 +691,7 @@
           <w:sz w:val="21"/>
           <w:szCs w:val="21"/>
         </w:rPr>
-        <w:t>Sales Executive</w:t>
+        <w:t>HR Assistant</w:t>
       </w:r>
       <w:r>
         <w:rPr>
@@ -838,7 +807,7 @@
           <w:sz w:val="21"/>
           <w:szCs w:val="21"/>
         </w:rPr>
-        <w:t>-</w:t>
+        <w:t>–</w:t>
       </w:r>
       <w:r>
         <w:rPr>
@@ -854,7 +823,7 @@
           <w:sz w:val="21"/>
           <w:szCs w:val="21"/>
         </w:rPr>
-        <w:t>Present</w:t>
+        <w:t>11/2025</w:t>
       </w:r>
     </w:p>
     <w:p>
@@ -1842,8 +1811,6 @@
         </w:rPr>
         <w:t>KMHSS</w:t>
       </w:r>
-      <w:bookmarkStart w:id="0" w:name="_GoBack"/>
-      <w:bookmarkEnd w:id="0"/>
       <w:r>
         <w:rPr>
           <w:rFonts w:ascii="Palatino Linotype" w:eastAsia="Arial Unicode MS" w:hAnsi="Palatino Linotype" w:cstheme="minorHAnsi"/>

</xml_diff>